<commit_message>
Strip raw file-path mentions from JNR.docx prose, keep them in README only
</commit_message>
<xml_diff>
--- a/documents/JNR.docx
+++ b/documents/JNR.docx
@@ -132,7 +132,7 @@
         <w:pStyle w:val="ListBullet"/>
       </w:pPr>
       <w:r>
-        <w:t>The within-episode evasion curve in results/attack_generation_curve.csv. It climbs from 8.3% at generation 0 to 100% by generation 6, which is what a search process looks like when it's actually searching rather than getting lucky once.</w:t>
+        <w:t>The within-episode evasion curve, which climbs from 8.3% at generation 0 to 100% by generation 6, is what a search process looks like when it's actually searching rather than getting lucky once.</w:t>
       </w:r>
     </w:p>
     <w:p>
@@ -140,7 +140,7 @@
         <w:pStyle w:val="ListBullet"/>
       </w:pPr>
       <w:r>
-        <w:t>results/evasion_curve.json, which tracks clean-set PR-AUC across all eight retraining rounds alongside attack success, specifically so a detector that raises evasion-resistance by flagging everything would show up as a PR-AUC collapse. In this run it's not a clean win either way: clean PR-AUC holds in a 0.87-0.91 band for the first seven rounds, then drops to 0.70 at round 7, a dip we haven't root-caused and left flagged rather than smoothed over. Attack success stays at or near 100% almost every round regardless.</w:t>
+        <w:t>The eight-round retraining log, which tracks clean-set PR-AUC alongside attack success so a detector that raises evasion-resistance by flagging everything would show up as a PR-AUC collapse. In this run it's not a clean win either way: clean PR-AUC holds in a 0.87-0.91 band for the first seven rounds, then drops to 0.70 at round 7, a dip we haven't root-caused and left flagged rather than smoothed over. Attack success stays at or near 100% almost every round regardless.</w:t>
       </w:r>
     </w:p>
     <w:p>
@@ -156,7 +156,7 @@
         <w:pStyle w:val="ListBullet"/>
       </w:pPr>
       <w:r>
-        <w:t>identify/taxonomy.yaml, fifteen attack rows, each tied to a named incident, a protocol spec, or a regulator filing. Where a figure came from a vendor with a reason to inflate it, that's noted next to the figure, not left out.</w:t>
+        <w:t>The attack taxonomy: fifteen rows, each tied to a named incident, a protocol spec, or a regulator filing. Where a figure came from a vendor with a reason to inflate it, that's noted next to the figure, not left out.</w:t>
       </w:r>
     </w:p>
     <w:p>
@@ -471,7 +471,7 @@
     </w:p>
     <w:p>
       <w:r>
-        <w:t>A list of attack categories without sourcing is easy to produce and hard to trust. Each row in our taxonomy is tied to a named incident, a protocol specification, or a regulator filing, and when a figure comes from a vendor that has a commercial reason to inflate it, that context sits right next to the number rather than in a footnote someone has to go looking for. The full matrix runs to 15 rows across six surfaces (S1×3, S2×3, S3×2, S4×3, S5×2, S6×2), is schema-validated in CI, and lives at identify/taxonomy.yaml. The table below is a representative subset.</w:t>
+        <w:t>A list of attack categories without sourcing is easy to produce and hard to trust. Each row in our taxonomy is tied to a named incident, a protocol specification, or a regulator filing, and when a figure comes from a vendor that has a commercial reason to inflate it, that context sits right next to the number rather than in a footnote someone has to go looking for. The full matrix runs to 15 rows across six surfaces (S1×3, S2×3, S3×2, S4×3, S5×2, S6×2) and is schema-validated in CI. The table below is a representative subset.</w:t>
       </w:r>
     </w:p>
     <w:tbl>
@@ -1399,7 +1399,7 @@
     </w:p>
     <w:p>
       <w:r>
-        <w:t>In attack episode 0, against a fixed detector and a 60-candidate population, evasion success starts at 8.3% in generation 0, reaches 70.0% by generation 2, hits 100% at generation 6, and stays there through generation 14 (results/attack_generation_curve.csv). That shape — a steady climb rather than a jump — is what tells us the search is doing the work, not the initial population getting lucky.</w:t>
+        <w:t>In attack episode 0, against a fixed detector and a 60-candidate population, evasion success starts at 8.3% in generation 0, reaches 70.0% by generation 2, hits 100% at generation 6, and stays there through generation 14. That shape — a steady climb rather than a jump — is what tells us the search is doing the work, not the initial population getting lucky.</w:t>
       </w:r>
     </w:p>
     <w:tbl>
@@ -2337,11 +2337,6 @@
       </w:r>
     </w:p>
     <w:p>
-      <w:r>
-        <w:t>Full curve: results/evasion_curve.json</w:t>
-      </w:r>
-    </w:p>
-    <w:p>
       <w:pPr>
         <w:pStyle w:val="Heading1"/>
       </w:pPr>
@@ -3252,7 +3247,7 @@
         <w:br/>
         <w:t>Mastercard Innovation Challenge @ GFF 2026</w:t>
         <w:br/>
-        <w:t>See README.md, ETHICS.md, and identify/taxonomy.yaml in the project repository</w:t>
+        <w:t>Full documentation, ethics notes, and the sourced attack taxonomy are in the project repository</w:t>
       </w:r>
     </w:p>
     <w:sectPr>

</xml_diff>